<commit_message>
Remove Cultural & Background subheadings from contextual section of production template
</commit_message>
<xml_diff>
--- a/templates/production.docx
+++ b/templates/production.docx
@@ -279,29 +279,25 @@
           <w:sz w:val="21"/>
           <w:szCs w:val="21"/>
         </w:rPr>
-        <w:t>{</w:t>
+        <w:t>{#contextNotesCultural}</w:t>
       </w:r>
       <w:r>
         <w:rPr>
           <w:rFonts w:eastAsia="Arial" w:cs="Arial"/>
           <w:b/>
           <w:bCs/>
-          <w:color w:val="2A9D8F"/>
-          <w:sz w:val="21"/>
-          <w:szCs w:val="21"/>
-        </w:rPr>
-        <w:t>contextNotesCultural</w:t>
-      </w:r>
-      <w:r>
-        <w:rPr>
-          <w:rFonts w:eastAsia="Arial" w:cs="Arial"/>
-          <w:b/>
-          <w:bCs/>
-          <w:color w:val="2A9D8F"/>
-          <w:sz w:val="21"/>
-          <w:szCs w:val="21"/>
-        </w:rPr>
-        <w:t>Heading}</w:t>
+          <w:sz w:val="21"/>
+          <w:szCs w:val="21"/>
+        </w:rPr>
+        <w:t xml:space="preserve">{title} — </w:t>
+      </w:r>
+      <w:r>
+        <w:rPr>
+          <w:rFonts w:eastAsia="Arial" w:cs="Arial"/>
+          <w:sz w:val="21"/>
+          <w:szCs w:val="21"/>
+        </w:rPr>
+        <w:t>{text}</w:t>
       </w:r>
     </w:p>
     <w:p>
@@ -309,43 +305,6 @@
         <w:pStyle w:val="Normal"/>
         <w:spacing w:lineRule="auto" w:line="276" w:before="0" w:after="60"/>
         <w:ind w:left="0" w:right="0"/>
-        <w:rPr/>
-      </w:pPr>
-      <w:r>
-        <w:rPr>
-          <w:rFonts w:eastAsia="Arial" w:cs="Arial"/>
-          <w:b/>
-          <w:bCs/>
-          <w:color w:val="2A9D8F"/>
-          <w:sz w:val="21"/>
-          <w:szCs w:val="21"/>
-        </w:rPr>
-        <w:t>{#contextNotesCultural}</w:t>
-      </w:r>
-      <w:r>
-        <w:rPr>
-          <w:rFonts w:eastAsia="Arial" w:cs="Arial"/>
-          <w:b/>
-          <w:bCs/>
-          <w:sz w:val="21"/>
-          <w:szCs w:val="21"/>
-        </w:rPr>
-        <w:t xml:space="preserve">{title} — </w:t>
-      </w:r>
-      <w:r>
-        <w:rPr>
-          <w:rFonts w:eastAsia="Arial" w:cs="Arial"/>
-          <w:sz w:val="21"/>
-          <w:szCs w:val="21"/>
-        </w:rPr>
-        <w:t>{text}</w:t>
-      </w:r>
-    </w:p>
-    <w:p>
-      <w:pPr>
-        <w:pStyle w:val="Normal"/>
-        <w:spacing w:lineRule="auto" w:line="276" w:before="0" w:after="60"/>
-        <w:ind w:left="0" w:right="0"/>
         <w:rPr>
           <w:rFonts w:ascii="Arial" w:hAnsi="Arial" w:eastAsia="Arial" w:cs="Arial"/>
           <w:sz w:val="21"/>
@@ -359,47 +318,6 @@
           <w:szCs w:val="21"/>
         </w:rPr>
         <w:t>{/}</w:t>
-      </w:r>
-    </w:p>
-    <w:p>
-      <w:pPr>
-        <w:pStyle w:val="Normal"/>
-        <w:spacing w:lineRule="auto" w:line="276" w:before="0" w:after="60"/>
-        <w:ind w:left="0" w:right="0"/>
-        <w:rPr/>
-      </w:pPr>
-      <w:r>
-        <w:rPr>
-          <w:rFonts w:eastAsia="Arial" w:cs="Arial"/>
-          <w:b/>
-          <w:bCs/>
-          <w:color w:val="2A9D8F"/>
-          <w:sz w:val="21"/>
-          <w:szCs w:val="21"/>
-        </w:rPr>
-        <w:t>{</w:t>
-      </w:r>
-      <w:r>
-        <w:rPr>
-          <w:rFonts w:eastAsia="Arial" w:cs="Arial"/>
-          <w:b/>
-          <w:bCs/>
-          <w:color w:val="2A9D8F"/>
-          <w:sz w:val="21"/>
-          <w:szCs w:val="21"/>
-        </w:rPr>
-        <w:t>contextNotesBackground</w:t>
-      </w:r>
-      <w:r>
-        <w:rPr>
-          <w:rFonts w:eastAsia="Arial" w:cs="Arial"/>
-          <w:b/>
-          <w:bCs/>
-          <w:color w:val="2A9D8F"/>
-          <w:sz w:val="21"/>
-          <w:szCs w:val="21"/>
-        </w:rPr>
-        <w:t>Heading}</w:t>
       </w:r>
     </w:p>
     <w:p>

</xml_diff>